<commit_message>
chore: mise à jour DOCX export
</commit_message>
<xml_diff>
--- a/public/downloads/ins-mv-rogue-srd.docx
+++ b/public/downloads/ins-mv-rogue-srd.docx
@@ -14,7 +14,7 @@
           <w:color w:val="2B6CB0"/>
           <w:sz w:val="64"/>
         </w:rPr>
-        <w:t>INS·MV ROGUE</w:t>
+        <w:t>ROGUE</w:t>
       </w:r>
     </w:p>
     <w:p>
@@ -40,39 +40,44 @@
         <w:pStyle w:val="Heading1"/>
       </w:pPr>
       <w:r>
-        <w:t>System Reference Document</w:t>
-      </w:r>
-    </w:p>
-    <w:p>
-      <w:r>
-        <w:rPr>
-          <w:b w:val="0"/>
-          <w:i w:val="0"/>
-        </w:rPr>
-        <w:t>Bienvenue dans le SRD d'</w:t>
-      </w:r>
-      <w:r>
-        <w:rPr>
-          <w:b/>
-          <w:i w:val="0"/>
-        </w:rPr>
-        <w:t>INS-MV ROGUE</w:t>
-      </w:r>
-      <w:r>
-        <w:rPr>
-          <w:b w:val="0"/>
-          <w:i w:val="0"/>
-        </w:rPr>
-        <w:t xml:space="preserve"> — la guerre secrète entre anges et démons, vue de l'intérieur.</w:t>
-      </w:r>
-    </w:p>
-    <w:p>
-      <w:r>
-        <w:rPr>
-          <w:b w:val="0"/>
-          <w:i w:val="0"/>
-        </w:rPr>
-        <w:t>Navigue dans les sections ci-dessous via la barre latérale gauche.</w:t>
+        <w:t>ROGUE — System Reference Document</w:t>
+      </w:r>
+    </w:p>
+    <w:p>
+      <w:r>
+        <w:rPr>
+          <w:b w:val="0"/>
+          <w:i w:val="0"/>
+        </w:rPr>
+        <w:t xml:space="preserve">Bienvenue sur le System Reference Document de </w:t>
+      </w:r>
+      <w:r>
+        <w:rPr>
+          <w:b/>
+          <w:i w:val="0"/>
+        </w:rPr>
+        <w:t>ROGUE</w:t>
+      </w:r>
+      <w:r>
+        <w:rPr>
+          <w:b w:val="0"/>
+          <w:i w:val="0"/>
+        </w:rPr>
+        <w:t xml:space="preserve">, un système de jeu de rôle. Ce site présente l'intégralité des règles, ainsi que </w:t>
+      </w:r>
+      <w:r>
+        <w:rPr>
+          <w:b/>
+          <w:i w:val="0"/>
+        </w:rPr>
+        <w:t>INS-MV</w:t>
+      </w:r>
+      <w:r>
+        <w:rPr>
+          <w:b w:val="0"/>
+          <w:i w:val="0"/>
+        </w:rPr>
+        <w:t>, son setting de référence : une guerre secrète entre anges et démons, vue de l'intérieur, dans le monde contemporain.</w:t>
       </w:r>
     </w:p>
     <w:p>
@@ -128,68 +133,157 @@
           <w:b w:val="0"/>
           <w:i w:val="0"/>
         </w:rPr>
-        <w:t xml:space="preserve">Création d'âme, </w:t>
-      </w:r>
-      <w:r>
-        <w:rPr>
-          <w:b w:val="0"/>
-          <w:i w:val="0"/>
+        <w:t>Création d'âme, caractéristiques, rang céleste, progression, réincarnation.</w:t>
+      </w:r>
+    </w:p>
+    <w:p>
+      <w:pPr>
+        <w:spacing w:after="40"/>
+      </w:pPr>
+      <w:r>
+        <w:rPr>
+          <w:b/>
           <w:color w:val="2B6CB0"/>
         </w:rPr>
-        <w:t>caractéristiques</w:t>
-      </w:r>
-      <w:r>
-        <w:rPr>
-          <w:b w:val="0"/>
-          <w:i w:val="0"/>
-        </w:rPr>
-        <w:t xml:space="preserve">, </w:t>
-      </w:r>
-      <w:r>
-        <w:rPr>
-          <w:b w:val="0"/>
-          <w:i w:val="0"/>
+        <w:t>Mécanique</w:t>
+      </w:r>
+    </w:p>
+    <w:p>
+      <w:pPr>
+        <w:ind w:left="283"/>
+      </w:pPr>
+      <w:r>
+        <w:rPr>
+          <w:b w:val="0"/>
+          <w:i w:val="0"/>
+        </w:rPr>
+        <w:t>Résolution D666, combat, pouvoirs, compétences, énergie, blessures.</w:t>
+      </w:r>
+    </w:p>
+    <w:p>
+      <w:pPr>
+        <w:spacing w:after="40"/>
+      </w:pPr>
+      <w:r>
+        <w:rPr>
+          <w:b/>
           <w:color w:val="2B6CB0"/>
         </w:rPr>
-        <w:t>rang céleste</w:t>
-      </w:r>
-      <w:r>
-        <w:rPr>
-          <w:b w:val="0"/>
-          <w:i w:val="0"/>
-        </w:rPr>
-        <w:t xml:space="preserve">, progression, </w:t>
-      </w:r>
-      <w:r>
-        <w:rPr>
-          <w:b w:val="0"/>
-          <w:i w:val="0"/>
+        <w:t>Référence</w:t>
+      </w:r>
+    </w:p>
+    <w:p>
+      <w:pPr>
+        <w:ind w:left="283"/>
+      </w:pPr>
+      <w:r>
+        <w:rPr>
+          <w:b w:val="0"/>
+          <w:i w:val="0"/>
+        </w:rPr>
+        <w:t>Mots-clés, états, équipement — toutes les tables et glossaires.</w:t>
+      </w:r>
+    </w:p>
+    <w:p>
+      <w:pPr>
+        <w:spacing w:after="40"/>
+      </w:pPr>
+      <w:r>
+        <w:rPr>
+          <w:b/>
           <w:color w:val="2B6CB0"/>
         </w:rPr>
-        <w:t>réincarnation</w:t>
-      </w:r>
-      <w:r>
-        <w:rPr>
-          <w:b w:val="0"/>
-          <w:i w:val="0"/>
-        </w:rPr>
-        <w:t>.</w:t>
-      </w:r>
-    </w:p>
-    <w:p>
-      <w:pPr>
-        <w:spacing w:after="40"/>
-      </w:pPr>
-      <w:r>
-        <w:rPr>
-          <w:b/>
+        <w:t>Document en cours de rédaction</w:t>
+      </w:r>
+    </w:p>
+    <w:p>
+      <w:pPr>
+        <w:ind w:left="283"/>
+      </w:pPr>
+      <w:r>
+        <w:rPr>
+          <w:b w:val="0"/>
+          <w:i w:val="0"/>
+        </w:rPr>
+        <w:t>Ce SRD est en cours de rédaction. Certaines sections peuvent être incomplètes ou en révision.</w:t>
+      </w:r>
+    </w:p>
+    <w:p>
+      <w:r>
+        <w:rPr>
+          <w:color w:val="4A4A6A"/>
+        </w:rPr>
+        <w:t>────────────────────────────────────────────────────────────</w:t>
+      </w:r>
+    </w:p>
+    <w:p>
+      <w:pPr>
+        <w:pStyle w:val="Heading2"/>
+      </w:pPr>
+      <w:r>
+        <w:rPr>
+          <w:b w:val="0"/>
+          <w:i w:val="0"/>
+        </w:rPr>
+        <w:t>Journal des mises à jour</w:t>
+      </w:r>
+    </w:p>
+    <w:p>
+      <w:pPr>
+        <w:pStyle w:val="Heading3"/>
+      </w:pPr>
+      <w:r>
+        <w:rPr>
+          <w:b w:val="0"/>
+          <w:i w:val="0"/>
+        </w:rPr>
+        <w:t>19 juillet 2026</w:t>
+      </w:r>
+    </w:p>
+    <w:p>
+      <w:pPr>
+        <w:pStyle w:val="ListBullet"/>
+        <w:ind w:left="283"/>
+      </w:pPr>
+      <w:r>
+        <w:rPr>
+          <w:b w:val="0"/>
+          <w:i w:val="0"/>
+        </w:rPr>
+        <w:t>Refonte complète du système de canalisation de la puissance : les Points d'Énergie laissent place à un système de dés de drain (fatigue magique) et de drain automatique (blessures directes au-delà du Rang Céleste).</w:t>
+      </w:r>
+    </w:p>
+    <w:p>
+      <w:pPr>
+        <w:pStyle w:val="ListBullet"/>
+        <w:ind w:left="283"/>
+      </w:pPr>
+      <w:r>
+        <w:rPr>
+          <w:b w:val="0"/>
+          <w:i w:val="0"/>
+        </w:rPr>
+        <w:t xml:space="preserve">Nouveau chapitre </w:t>
+      </w:r>
+      <w:r>
+        <w:rPr>
+          <w:b/>
+          <w:i w:val="0"/>
           <w:color w:val="2B6CB0"/>
         </w:rPr>
-        <w:t>Mécanique</w:t>
-      </w:r>
-    </w:p>
-    <w:p>
-      <w:pPr>
+        <w:t>Mots-clés de Pouvoirs</w:t>
+      </w:r>
+      <w:r>
+        <w:rPr>
+          <w:b w:val="0"/>
+          <w:i w:val="0"/>
+        </w:rPr>
+        <w:t xml:space="preserve"> : Multicible, Portée, Durée, et des options propres à chaque attribut d'âme.</w:t>
+      </w:r>
+    </w:p>
+    <w:p>
+      <w:pPr>
+        <w:pStyle w:val="ListBullet"/>
         <w:ind w:left="283"/>
       </w:pPr>
       <w:r>
@@ -197,22 +291,48 @@
           <w:b w:val="0"/>
           <w:i w:val="0"/>
         </w:rPr>
-        <w:t xml:space="preserve">Résolution </w:t>
-      </w:r>
-      <w:r>
-        <w:rPr>
-          <w:b w:val="0"/>
+        <w:t xml:space="preserve">Nouveau chapitre </w:t>
+      </w:r>
+      <w:r>
+        <w:rPr>
+          <w:b/>
           <w:i w:val="0"/>
           <w:color w:val="2B6CB0"/>
         </w:rPr>
-        <w:t>D666</w:t>
-      </w:r>
-      <w:r>
-        <w:rPr>
-          <w:b w:val="0"/>
-          <w:i w:val="0"/>
-        </w:rPr>
-        <w:t xml:space="preserve">, combat, pouvoirs, </w:t>
+        <w:t>Santé Mentale</w:t>
+      </w:r>
+      <w:r>
+        <w:rPr>
+          <w:b w:val="0"/>
+          <w:i w:val="0"/>
+        </w:rPr>
+        <w:t xml:space="preserve"> pour les hôtes humains confrontés à l'horreur surnaturelle.</w:t>
+      </w:r>
+    </w:p>
+    <w:p>
+      <w:pPr>
+        <w:pStyle w:val="ListBullet"/>
+        <w:ind w:left="283"/>
+      </w:pPr>
+      <w:r>
+        <w:rPr>
+          <w:b w:val="0"/>
+          <w:i w:val="0"/>
+        </w:rPr>
+        <w:t>Le trait Conduit Divin convertit désormais un drain automatique en simple dé de drain, une fois par combat et par niveau.</w:t>
+      </w:r>
+    </w:p>
+    <w:p>
+      <w:pPr>
+        <w:pStyle w:val="ListBullet"/>
+        <w:ind w:left="283"/>
+      </w:pPr>
+      <w:r>
+        <w:rPr>
+          <w:b w:val="0"/>
+          <w:i w:val="0"/>
+        </w:rPr>
+        <w:t xml:space="preserve">Mise en forme entièrement revue de la page </w:t>
       </w:r>
       <w:r>
         <w:rPr>
@@ -220,62 +340,32 @@
           <w:i w:val="0"/>
           <w:color w:val="2B6CB0"/>
         </w:rPr>
-        <w:t>compétences</w:t>
-      </w:r>
-      <w:r>
-        <w:rPr>
-          <w:b w:val="0"/>
-          <w:i w:val="0"/>
-        </w:rPr>
-        <w:t>, énergie, blessures.</w:t>
-      </w:r>
-    </w:p>
-    <w:p>
-      <w:pPr>
-        <w:spacing w:after="40"/>
-      </w:pPr>
-      <w:r>
-        <w:rPr>
-          <w:b/>
-          <w:color w:val="2B6CB0"/>
-        </w:rPr>
-        <w:t>Référence</w:t>
-      </w:r>
-    </w:p>
-    <w:p>
-      <w:pPr>
+        <w:t>Setting</w:t>
+      </w:r>
+      <w:r>
+        <w:rPr>
+          <w:b w:val="0"/>
+          <w:i w:val="0"/>
+        </w:rPr>
+        <w:t>, désormais lisible.</w:t>
+      </w:r>
+    </w:p>
+    <w:p>
+      <w:pPr>
+        <w:pStyle w:val="ListBullet"/>
         <w:ind w:left="283"/>
       </w:pPr>
       <w:r>
         <w:rPr>
           <w:b w:val="0"/>
           <w:i w:val="0"/>
-          <w:color w:val="2B6CB0"/>
-        </w:rPr>
-        <w:t>Mots-clés</w:t>
-      </w:r>
-      <w:r>
-        <w:rPr>
-          <w:b w:val="0"/>
-          <w:i w:val="0"/>
-        </w:rPr>
-        <w:t>, états, équipement — toutes les tables et glossaires.</w:t>
-      </w:r>
-    </w:p>
-    <w:p>
-      <w:pPr>
-        <w:spacing w:after="40"/>
-      </w:pPr>
-      <w:r>
-        <w:rPr>
-          <w:b/>
-          <w:color w:val="2B6CB0"/>
-        </w:rPr>
-        <w:t>Document vivant</w:t>
-      </w:r>
-    </w:p>
-    <w:p>
-      <w:pPr>
+        </w:rPr>
+        <w:t>Le SRD s'installe comme une application sur mobile et reste consultable hors-ligne, avec mise à jour automatique dès qu'une nouvelle version est publiée.</w:t>
+      </w:r>
+    </w:p>
+    <w:p>
+      <w:pPr>
+        <w:pStyle w:val="ListBullet"/>
         <w:ind w:left="283"/>
       </w:pPr>
       <w:r>
@@ -283,7 +373,7 @@
           <w:b w:val="0"/>
           <w:i w:val="0"/>
         </w:rPr>
-        <w:t>Ce SRD est en cours de rédaction. Certaines sections peuvent être incomplètes ou en révision.</w:t>
+        <w:t>Export DOCX entièrement revu (tableaux d'équipement, mise en forme) et téléchargement corrigé.</w:t>
       </w:r>
     </w:p>
     <w:p>

</xml_diff>